<commit_message>
feat: fix the sen preheater and oven issue
</commit_message>
<xml_diff>
--- a/SEN_Oven_Offer_Template.docx
+++ b/SEN_Oven_Offer_Template.docx
@@ -2419,7 +2419,7 @@
         </w:rPr>
       </w:r>
       <w:r>
-        <w:t>SEN PREHEATING OVEN</w:t>
+        <w:t>SEN OVEN</w:t>
       </w:r>
     </w:p>
     <w:tbl>
@@ -2478,7 +2478,7 @@
                 <w:color w:val="FFFFFF"/>
                 <w:sz w:val="20"/>
               </w:rPr>
-              <w:t>TECHNICAL SPECIFICATIONS: SEN PREHEATING OVEN</w:t>
+              <w:t>TECHNICAL SPECIFICATIONS: SEN OVEN</w:t>
             </w:r>
           </w:p>
           <w:p>
@@ -2860,7 +2860,7 @@
         </w:rPr>
       </w:r>
       <w:r>
-        <w:t>ANNEXURE I — SCOPE OF SUPPLY: SEN PREHEATING OVEN</w:t>
+        <w:t>ANNEXURE I — SCOPE OF SUPPLY: SEN OVEN</w:t>
       </w:r>
     </w:p>
     <w:p>
@@ -3010,7 +3010,7 @@
           <w:sz w:val="19"/>
           <w:szCs w:val="19"/>
         </w:rPr>
-        <w:t>Our scope of supply will cover design, engineering, manufacture supply, supervision of commissioning &amp; erection of the following main components for SEN Preheating Oven:</w:t>
+        <w:t>Our scope of supply will cover design, engineering, manufacture supply, supervision of commissioning &amp; erection of the following main components for SEN Oven:</w:t>
       </w:r>
     </w:p>
     <w:p>
@@ -3646,7 +3646,7 @@
                 <w:b w:val="0"/>
                 <w:sz w:val="18"/>
               </w:rPr>
-              <w:t>SEN Preheating Oven ({{ gas_line }} Line)</w:t>
+              <w:t>SEN Oven ({{ gas_line }} Line)</w:t>
             </w:r>
           </w:p>
         </w:tc>

</xml_diff>